<commit_message>
feat: regenerate power-platform-community-conference with its brand theme
- render four voices with the brand header band, palette and fonts

🎨 - Generated by Copilot

Co-authored-by: Copilot <223556219+Copilot@users.noreply.github.com>
</commit_message>
<xml_diff>
--- a/projects/power-platform-community-conference/release/outputs/document.docx
+++ b/projects/power-platform-community-conference/release/outputs/document.docx
@@ -93,27 +93,27 @@
     </w:p>
     <w:p>
       <w:r>
-        <w:t xml:space="preserve">Bottom line: recommend sending a focused cross-functional team to PPCC 2026 with one objective: return with a governed AI, app, and automation pilot proposal.</w:t>
-      </w:r>
-    </w:p>
-    <w:p>
-      <w:r>
-        <w:t xml:space="preserve">This is a recommendation, not a measured outcome. Treat the event as a structured learning sprint for business, platform, data, and risk leaders.</w:t>
-      </w:r>
-    </w:p>
-    <w:p>
-      <w:r>
-        <w:t xml:space="preserve">PPCC runs October 27 through 29 at the MGM Grand in Las Vegas. Applied workshops run before and after the main conference.</w:t>
-      </w:r>
-    </w:p>
-    <w:p>
-      <w:r>
-        <w:t xml:space="preserve">Microsoft frames PPCC around Copilot, agents, apps, automation, and data. The program connects those capabilities to trusted data, implementation, architecture, and governance. That is the bridge from innovation ambition to execution controls.</w:t>
-      </w:r>
-    </w:p>
-    <w:p>
-      <w:r>
-        <w:t xml:space="preserve">After the event, require one pilot charter naming the workflow, owner, trusted data, guardrails, and a testable success measure. Expand only when that evidence supports the next decision.</w:t>
+        <w:t xml:space="preserve">PPCC 2026 is an upcoming opportunity to connect agents, apps, automation, trusted data, and governance to a concrete executive pilot decision.</w:t>
+      </w:r>
+    </w:p>
+    <w:p>
+      <w:r>
+        <w:t xml:space="preserve">Recommendation: send a focused business, platform, data, and risk team with one mandate: return with a governed AI, app, and automation pilot charter.</w:t>
+      </w:r>
+    </w:p>
+    <w:p>
+      <w:r>
+        <w:t xml:space="preserve">Main conference: October 27-29 at the MGM Grand in Las Vegas. Workshops: October 25-26 and October 30.</w:t>
+      </w:r>
+    </w:p>
+    <w:p>
+      <w:r>
+        <w:t xml:space="preserve">PPCC connects agents, apps, automation, and trusted data with implementation, architecture, governance, and AI-driven scenarios.</w:t>
+      </w:r>
+    </w:p>
+    <w:p>
+      <w:r>
+        <w:t xml:space="preserve">Ask the team to return with the workflow, owner, trusted data, guardrails, and testable success measure for one pilot. Expansion should depend on that evidence, not conference enthusiasm.</w:t>
       </w:r>
     </w:p>
     <w:p>
@@ -494,8 +494,8 @@
   <w:docDefaults>
     <w:rPrDefault>
       <w:rPr>
-        <w:rFonts w:ascii="Arial" w:hAnsi="Arial" w:cs="Arial"/>
-        <w:color w:val="111827"/>
+        <w:rFonts w:ascii="Montserrat" w:hAnsi="Montserrat" w:cs="Montserrat"/>
+        <w:color w:val="081222"/>
         <w:sz w:val="22"/>
       </w:rPr>
     </w:rPrDefault>
@@ -516,13 +516,16 @@
     <w:qFormat/>
     <w:pPr>
       <w:keepNext/>
+      <w:pBdr>
+        <w:bottom w:val="single" w:sz="24" w:space="6" w:color="2FFFE0"/>
+      </w:pBdr>
       <w:spacing w:before="0" w:after="240"/>
       <w:jc w:val="left"/>
     </w:pPr>
     <w:rPr>
-      <w:rFonts w:ascii="Arial" w:hAnsi="Arial" w:cs="Arial"/>
+      <w:rFonts w:ascii="Montserrat" w:hAnsi="Montserrat" w:cs="Montserrat"/>
       <w:b/>
-      <w:color w:val="156866"/>
+      <w:color w:val="0A172A"/>
       <w:sz w:val="52"/>
     </w:rPr>
   </w:style>
@@ -537,9 +540,9 @@
       <w:outlineLvl w:val="0"/>
     </w:pPr>
     <w:rPr>
-      <w:rFonts w:ascii="Arial" w:hAnsi="Arial" w:cs="Arial"/>
+      <w:rFonts w:ascii="Montserrat" w:hAnsi="Montserrat" w:cs="Montserrat"/>
       <w:b/>
-      <w:color w:val="156866"/>
+      <w:color w:val="0A172A"/>
       <w:sz w:val="32"/>
     </w:rPr>
   </w:style>
@@ -554,16 +557,16 @@
       <w:outlineLvl w:val="1"/>
     </w:pPr>
     <w:rPr>
-      <w:rFonts w:ascii="Arial" w:hAnsi="Arial" w:cs="Arial"/>
+      <w:rFonts w:ascii="Montserrat" w:hAnsi="Montserrat" w:cs="Montserrat"/>
       <w:b/>
-      <w:color w:val="156866"/>
+      <w:color w:val="0A172A"/>
       <w:sz w:val="24"/>
     </w:rPr>
   </w:style>
   <w:style w:type="character" w:styleId="Hyperlink">
     <w:name w:val="Hyperlink"/>
     <w:rPr>
-      <w:color w:val="0563C1"/>
+      <w:color w:val="17796A"/>
       <w:u w:val="single"/>
     </w:rPr>
   </w:style>

</xml_diff>